<commit_message>
Roman reels: plan — avatars created by Viktor
Co-Authored-By: Claude Opus 5.5 <noreply@anthropic.com>
Claude-Session: https://claude.ai/code/session_012XK78gBCYLJFULW6X1fJk1
</commit_message>
<xml_diff>
--- a/roman-reels/docs/Roman-plan-deystviy.docx
+++ b/roman-reels/docs/Roman-plan-deystviy.docx
@@ -42,7 +42,7 @@
         <w:pStyle w:val="Heading1"/>
       </w:pPr>
       <w:r>
-        <w:t>Шаг 2. Создать 2 аватара в HeyGen</w:t>
+        <w:t>Шаг 2. Создать 2 аватара в HeyGen — делает Виктор</w:t>
       </w:r>
     </w:p>
     <w:p>
@@ -51,7 +51,7 @@
           <w:b w:val="0"/>
           <w:i w:val="0"/>
         </w:rPr>
-        <w:t>Из записей 8 октября (папка на Google Диске):</w:t>
+        <w:t>Из записей 8 октября (папка на Google Диске). Если HeyGen попросит подтверждение личности (видео-согласие), понадобится Роман — 1 минута.</w:t>
       </w:r>
     </w:p>
     <w:p>

</xml_diff>